<commit_message>
Complete lab 8 sources and update lab report title pages
</commit_message>
<xml_diff>
--- a/lab2_report.docx
+++ b/lab2_report.docx
@@ -216,78 +216,8 @@
     </w:p>
     <w:p>
       <w:pPr>
-        <w:spacing w:line="360" w:lineRule="auto"/>
-        <w:jc w:val="center"/>
-        <w:rPr>
-          <w:rFonts w:ascii="Times New Roman" w:eastAsia="Times New Roman" w:hAnsi="Times New Roman" w:cs="Times New Roman"/>
-          <w:b/>
-          <w:bCs/>
-          <w:sz w:val="28"/>
-          <w:szCs w:val="28"/>
-          <w:lang w:val="en-US"/>
-        </w:rPr>
-      </w:pPr>
-      <w:r>
-        <w:rPr>
-          <w:rFonts w:ascii="Times New Roman" w:eastAsia="Times New Roman" w:hAnsi="Times New Roman" w:cs="Times New Roman"/>
-          <w:b/>
-          <w:bCs/>
-          <w:sz w:val="28"/>
-          <w:szCs w:val="28"/>
-          <w:lang w:val="en-US"/>
-        </w:rPr>
-        <w:t>Cimendur Rustem</w:t>
-      </w:r>
-    </w:p>
-    <w:p>
-      <w:pPr>
-        <w:spacing w:line="360" w:lineRule="auto"/>
-        <w:jc w:val="center"/>
-        <w:rPr>
-          <w:rFonts w:ascii="Times New Roman" w:eastAsia="Times New Roman" w:hAnsi="Times New Roman" w:cs="Times New Roman"/>
-          <w:b/>
-          <w:bCs/>
-          <w:sz w:val="28"/>
-          <w:szCs w:val="28"/>
-          <w:lang w:val="en-US"/>
-        </w:rPr>
-      </w:pPr>
-      <w:r>
-        <w:rPr>
-          <w:rFonts w:ascii="Times New Roman" w:eastAsia="Times New Roman" w:hAnsi="Times New Roman" w:cs="Times New Roman"/>
-          <w:b/>
-          <w:bCs/>
-          <w:sz w:val="28"/>
-          <w:szCs w:val="28"/>
-          <w:lang w:val="en-US"/>
-        </w:rPr>
-        <w:t xml:space="preserve"> </w:t>
-      </w:r>
-      <w:r>
-        <w:rPr>
-          <w:rFonts w:ascii="Times New Roman" w:eastAsia="Times New Roman" w:hAnsi="Times New Roman" w:cs="Times New Roman"/>
-          <w:b/>
-          <w:bCs/>
-          <w:sz w:val="28"/>
-          <w:szCs w:val="28"/>
-        </w:rPr>
-        <w:t>FAF-24</w:t>
-      </w:r>
-      <w:r>
-        <w:rPr>
-          <w:rFonts w:ascii="Times New Roman" w:eastAsia="Times New Roman" w:hAnsi="Times New Roman" w:cs="Times New Roman"/>
-          <w:b/>
-          <w:bCs/>
-          <w:sz w:val="28"/>
-          <w:szCs w:val="28"/>
-          <w:lang w:val="en-US"/>
-        </w:rPr>
-        <w:t>3</w:t>
-      </w:r>
-    </w:p>
-    <w:p>
-      <w:pPr>
-        <w:spacing w:line="360" w:lineRule="auto"/>
+        <w:pStyle w:val="a3"/>
+        <w:spacing w:line="360" w:lineRule="auto" w:before="240" w:after="240"/>
         <w:jc w:val="center"/>
         <w:rPr>
           <w:rFonts w:ascii="Times New Roman" w:eastAsia="Times New Roman" w:hAnsi="Times New Roman" w:cs="Times New Roman"/>
@@ -303,11 +233,13 @@
           <w:rFonts w:ascii="Times New Roman" w:eastAsia="Times New Roman" w:hAnsi="Times New Roman" w:cs="Times New Roman"/>
           <w:b/>
           <w:bCs/>
-          <w:sz w:val="72"/>
+          <w:i w:val="0"/>
+          <w:color w:val="000000"/>
+          <w:sz w:val="44"/>
           <w:szCs w:val="72"/>
           <w:lang w:val="en-US"/>
         </w:rPr>
-        <w:t>Report</w:t>
+        <w:t>Building and extending xv6</w:t>
       </w:r>
     </w:p>
     <w:p>
@@ -332,7 +264,7 @@
           <w:szCs w:val="40"/>
           <w:lang w:val="en-US"/>
         </w:rPr>
-        <w:t>Laboratory work n.2</w:t>
+        <w:t>Laboratory work 2</w:t>
       </w:r>
     </w:p>
     <w:p>
@@ -506,8 +438,9 @@
     </w:p>
     <w:p>
       <w:pPr>
-        <w:spacing w:after="40"/>
-        <w:jc w:val="center"/>
+        <w:keepNext/>
+        <w:spacing w:line="360" w:lineRule="auto"/>
+        <w:jc w:val="right"/>
         <w:rPr>
           <w:rFonts w:ascii="Times New Roman" w:eastAsia="Times New Roman" w:hAnsi="Times New Roman" w:cs="Times New Roman"/>
           <w:b/>
@@ -517,11 +450,24 @@
           <w:lang w:val="en-US"/>
         </w:rPr>
       </w:pPr>
-    </w:p>
-    <w:p>
-      <w:pPr>
-        <w:spacing w:after="40"/>
-        <w:jc w:val="center"/>
+      <w:r>
+        <w:rPr>
+          <w:rFonts w:ascii="Times New Roman" w:eastAsia="Times New Roman" w:hAnsi="Times New Roman" w:cs="Times New Roman"/>
+          <w:b/>
+          <w:bCs/>
+          <w:color w:val="000000"/>
+          <w:sz w:val="28"/>
+          <w:szCs w:val="28"/>
+          <w:lang w:val="en-US"/>
+        </w:rPr>
+        <w:t>Done by: st. gr. FAF-243, Cimendur Rustem</w:t>
+      </w:r>
+    </w:p>
+    <w:p>
+      <w:pPr>
+        <w:keepNext/>
+        <w:spacing w:line="360" w:lineRule="auto"/>
+        <w:jc w:val="right"/>
         <w:rPr>
           <w:rFonts w:ascii="Times New Roman" w:eastAsia="Times New Roman" w:hAnsi="Times New Roman" w:cs="Times New Roman"/>
           <w:b/>
@@ -531,18 +477,47 @@
           <w:lang w:val="en-US"/>
         </w:rPr>
       </w:pPr>
-    </w:p>
-    <w:p>
-      <w:pPr>
+      <w:r>
+        <w:rPr>
+          <w:rFonts w:ascii="Times New Roman" w:eastAsia="Times New Roman" w:hAnsi="Times New Roman" w:cs="Times New Roman"/>
+          <w:b/>
+          <w:bCs/>
+          <w:color w:val="000000"/>
+          <w:sz w:val="28"/>
+          <w:szCs w:val="28"/>
+          <w:lang w:val="en-US"/>
+        </w:rPr>
+        <w:t xml:space="preserve">Checked by: Reițman Patricia, asist. univ.</w:t>
+      </w:r>
+      <w:r>
+        <w:rPr>
+          <w:rFonts w:ascii="Times New Roman" w:eastAsia="Times New Roman" w:hAnsi="Times New Roman" w:cs="Times New Roman"/>
+          <w:b/>
+          <w:bCs/>
+          <w:color w:val="000000"/>
+          <w:sz w:val="28"/>
+          <w:szCs w:val="28"/>
+        </w:rPr>
+        <w:t/>
+      </w:r>
+      <w:r>
+        <w:rPr>
+          <w:rFonts w:ascii="Times New Roman" w:eastAsia="Times New Roman" w:hAnsi="Times New Roman" w:cs="Times New Roman"/>
+          <w:b/>
+          <w:bCs/>
+          <w:color w:val="000000"/>
+          <w:sz w:val="28"/>
+          <w:szCs w:val="28"/>
+          <w:lang w:val="en-US"/>
+        </w:rPr>
+        <w:t/>
+      </w:r>
+    </w:p>
+    <w:p>
+      <w:pPr>
+        <w:keepNext/>
         <w:spacing w:after="40"/>
         <w:jc w:val="center"/>
-        <w:rPr>
-          <w:sz w:val="20"/>
-          <w:szCs w:val="20"/>
-          <w:lang w:val="en-US"/>
-        </w:rPr>
-      </w:pPr>
-      <w:r>
         <w:rPr>
           <w:rFonts w:ascii="Times New Roman" w:eastAsia="Times New Roman" w:hAnsi="Times New Roman" w:cs="Times New Roman"/>
           <w:b/>
@@ -551,7 +526,43 @@
           <w:szCs w:val="28"/>
           <w:lang w:val="en-US"/>
         </w:rPr>
-        <w:t>Chisinau - 2026</w:t>
+      </w:pPr>
+    </w:p>
+    <w:p>
+      <w:pPr>
+        <w:keepNext/>
+        <w:spacing w:after="40"/>
+        <w:jc w:val="center"/>
+        <w:rPr>
+          <w:rFonts w:ascii="Times New Roman" w:eastAsia="Times New Roman" w:hAnsi="Times New Roman" w:cs="Times New Roman"/>
+          <w:b/>
+          <w:bCs/>
+          <w:sz w:val="28"/>
+          <w:szCs w:val="28"/>
+          <w:lang w:val="en-US"/>
+        </w:rPr>
+      </w:pPr>
+    </w:p>
+    <w:p>
+      <w:pPr>
+        <w:spacing w:after="40"/>
+        <w:jc w:val="center"/>
+        <w:rPr>
+          <w:sz w:val="20"/>
+          <w:szCs w:val="20"/>
+          <w:lang w:val="en-US"/>
+        </w:rPr>
+      </w:pPr>
+      <w:r>
+        <w:rPr>
+          <w:rFonts w:ascii="Times New Roman" w:eastAsia="Times New Roman" w:hAnsi="Times New Roman" w:cs="Times New Roman"/>
+          <w:b/>
+          <w:bCs/>
+          <w:sz w:val="28"/>
+          <w:szCs w:val="28"/>
+          <w:lang w:val="en-US"/>
+        </w:rPr>
+        <w:t>Chișinău 2026</w:t>
       </w:r>
       <w:r>
         <w:rPr>
@@ -839,6 +850,7 @@
     </w:p>
     <w:p>
       <w:pPr>
+        <w:pStyle w:val="2"/>
         <w:spacing w:after="120"/>
         <w:rPr>
           <w:lang w:val="en-US"/>
@@ -850,7 +862,7 @@
           <w:sz w:val="24"/>
           <w:lang w:val="en-US"/>
         </w:rPr>
-        <w:t>Track B  Working with a small RISC-V operating system</w:t>
+        <w:t>Purpose of the work</w:t>
       </w:r>
     </w:p>
     <w:p>
@@ -1394,7 +1406,7 @@
           <w:sz w:val="18"/>
           <w:lang w:val="en-US"/>
         </w:rPr>
-        <w:t>Figure 1. The xv6 source directory, revision and installed tool versions</w:t>
+        <w:t>Figure 2.1 – The xv6 source directory, revision and installed tool versions</w:t>
       </w:r>
       <w:r>
         <w:rPr>
@@ -1468,7 +1480,7 @@
           <w:sz w:val="18"/>
           <w:lang w:val="en-US"/>
         </w:rPr>
-        <w:t>Figure 2. Disk-image creation and successful xv6 boot</w:t>
+        <w:t>Figure 2.2 – Disk-image creation and successful xv6 boot</w:t>
       </w:r>
     </w:p>
     <w:p>
@@ -1597,7 +1609,7 @@
           <w:sz w:val="18"/>
           <w:lang w:val="en-US"/>
         </w:rPr>
-        <w:t>Figure 3. The xv6 directory listing and the beginning of README</w:t>
+        <w:t>Figure 2.3 – The xv6 directory listing and the beginning of README</w:t>
       </w:r>
     </w:p>
     <w:p>
@@ -1662,7 +1674,7 @@
           <w:sz w:val="18"/>
           <w:lang w:val="en-US"/>
         </w:rPr>
-        <w:t>Figure 4. The printed message and the filtered output of ls through grep</w:t>
+        <w:t>Figure 2.4 – The printed message and the filtered output of ls through grep</w:t>
       </w:r>
     </w:p>
     <w:p>
@@ -1677,7 +1689,7 @@
           <w:color w:val="000000"/>
           <w:lang w:val="en-US"/>
         </w:rPr>
-        <w:t>ls | grep c retained names containing c, including cat, echo, wc, sync and console. The separate wc README test returned 48 lines, 336 words and 2,441 bytes; its output appears with the final program tests in Figure 9.</w:t>
+        <w:t>ls | grep c retained names containing c, including cat, echo, wc, sync and console. The separate wc README test returned 48 lines, 336 words and 2,441 bytes; its output appears with the final program tests in Figure 2.9.</w:t>
       </w:r>
       <w:r>
         <w:rPr>
@@ -1907,7 +1919,7 @@
           <w:sz w:val="18"/>
           <w:lang w:val="en-US"/>
         </w:rPr>
-        <w:t>Figure 5. The beginning of user/ls.c and its filename-formatting function</w:t>
+        <w:t>Figure 2.5 – The beginning of user/ls.c and its filename-formatting function</w:t>
       </w:r>
     </w:p>
     <w:p>
@@ -2036,7 +2048,7 @@
           <w:sz w:val="18"/>
           <w:lang w:val="en-US"/>
         </w:rPr>
-        <w:t>Figure 6. The complete user/cat.c implementation</w:t>
+        <w:t>Figure 2.6 – The complete user/cat.c implementation</w:t>
       </w:r>
     </w:p>
     <w:p>
@@ -2117,7 +2129,7 @@
           <w:sz w:val="18"/>
           <w:lang w:val="en-US"/>
         </w:rPr>
-        <w:t>Figure 7. Declarations in user/user.h and the locations of sys_read and sys_write</w:t>
+        <w:t>Figure 2.7 – Declarations in user/user.h and the locations of sys_read and sys_write</w:t>
       </w:r>
     </w:p>
     <w:p>
@@ -2365,7 +2377,7 @@
           <w:sz w:val="18"/>
           <w:lang w:val="en-US"/>
         </w:rPr>
-        <w:t>Figure 8. The new sleep source and its entry in the Makefile</w:t>
+        <w:t>Figure 2.8 – The new sleep source and its entry in the Makefile</w:t>
       </w:r>
     </w:p>
     <w:p>
@@ -2487,7 +2499,7 @@
           <w:sz w:val="18"/>
           <w:lang w:val="en-US"/>
         </w:rPr>
-        <w:t>Figure 9. Successful boot, sleep tests and the README word count</w:t>
+        <w:t>Figure 2.9 – Successful boot, sleep tests and the README word count</w:t>
       </w:r>
     </w:p>
     <w:tbl>

</xml_diff>